<commit_message>
add create gke cluster
</commit_message>
<xml_diff>
--- a/SRE Answer.docx
+++ b/SRE Answer.docx
@@ -82,7 +82,15 @@
             </w:r>
             <w:proofErr w:type="spellEnd"/>
             <w:r>
-              <w:t>/nexus3:${NEXUS_VERSION}</w:t>
+              <w:t>/nexus</w:t>
+            </w:r>
+            <w:proofErr w:type="gramStart"/>
+            <w:r>
+              <w:t>3:$</w:t>
+            </w:r>
+            <w:proofErr w:type="gramEnd"/>
+            <w:r>
+              <w:t>{NEXUS_VERSION}</w:t>
             </w:r>
           </w:p>
           <w:p>
@@ -97,12 +105,25 @@
           </w:p>
           <w:p>
             <w:r>
-              <w:t>ARG BUNDLE_NAME=nexus-blobstore-google-cloud-${PLUGIN_VERSION}-bundle.kar</w:t>
-            </w:r>
+              <w:t>ARG BUNDLE_NAME=nexus-blobstore-google-cloud-${PLUGIN_</w:t>
+            </w:r>
+            <w:proofErr w:type="gramStart"/>
+            <w:r>
+              <w:t>VERSION}-bundle.kar</w:t>
+            </w:r>
+            <w:proofErr w:type="gramEnd"/>
           </w:p>
           <w:p>
             <w:r>
-              <w:t>ARG KAR_URL=https://repo1.maven.org/maven2/org/sonatype/nexus/plugins/nexus-blobstore-google-cloud/${PLUGIN_VERSION}/${BUNDLE_NAME}</w:t>
+              <w:t>ARG KAR_URL=</w:t>
+            </w:r>
+            <w:proofErr w:type="gramStart"/>
+            <w:r>
+              <w:t>https://repo1.maven.org/maven2/org/sonatype/nexus/plugins/nexus-blobstore-google-cloud/${</w:t>
+            </w:r>
+            <w:proofErr w:type="gramEnd"/>
+            <w:r>
+              <w:t>PLUGIN_VERSION}/${BUNDLE_NAME}</w:t>
             </w:r>
           </w:p>
           <w:p>
@@ -128,10 +149,12 @@
               <w:t>=</w:t>
             </w:r>
             <w:proofErr w:type="spellStart"/>
+            <w:proofErr w:type="gramStart"/>
             <w:r>
               <w:t>nexus:nexus</w:t>
             </w:r>
             <w:proofErr w:type="spellEnd"/>
+            <w:proofErr w:type="gramEnd"/>
             <w:r>
               <w:t xml:space="preserve"> ${KAR_URL} /opt/</w:t>
             </w:r>
@@ -343,6 +366,9 @@
     <w:p/>
     <w:p>
       <w:r>
+        <w:rPr>
+          <w:noProof/>
+        </w:rPr>
         <w:lastRenderedPageBreak/>
         <w:drawing>
           <wp:inline distT="0" distB="0" distL="0" distR="0" wp14:anchorId="10CAF270" wp14:editId="3A259900">
@@ -477,6 +503,9 @@
     </w:p>
     <w:p>
       <w:r>
+        <w:rPr>
+          <w:noProof/>
+        </w:rPr>
         <w:drawing>
           <wp:inline distT="0" distB="0" distL="0" distR="0" wp14:anchorId="5FD296C0" wp14:editId="014E8EB6">
             <wp:extent cx="6675120" cy="3183890"/>
@@ -553,6 +582,172 @@
         <w:t>Deploy</w:t>
       </w:r>
     </w:p>
+    <w:p>
+      <w:pPr>
+        <w:pStyle w:val="Judul2"/>
+        <w:numPr>
+          <w:ilvl w:val="1"/>
+          <w:numId w:val="1"/>
+        </w:numPr>
+        <w:ind w:left="540" w:hanging="540"/>
+      </w:pPr>
+      <w:r>
+        <w:t>Deploy Terraform GKE Cluster and Cloud Storage Bucket</w:t>
+      </w:r>
+    </w:p>
+    <w:p>
+      <w:r>
+        <w:t>Steps:</w:t>
+      </w:r>
+    </w:p>
+    <w:p>
+      <w:r>
+        <w:lastRenderedPageBreak/>
+        <w:t xml:space="preserve">cd </w:t>
+      </w:r>
+      <w:proofErr w:type="gramStart"/>
+      <w:r>
+        <w:t>terraform</w:t>
+      </w:r>
+      <w:proofErr w:type="gramEnd"/>
+    </w:p>
+    <w:p>
+      <w:r>
+        <w:t xml:space="preserve">terraform </w:t>
+      </w:r>
+      <w:proofErr w:type="spellStart"/>
+      <w:r>
+        <w:t>init</w:t>
+      </w:r>
+      <w:proofErr w:type="spellEnd"/>
+    </w:p>
+    <w:p>
+      <w:r>
+        <w:t>terraform validate</w:t>
+      </w:r>
+    </w:p>
+    <w:p>
+      <w:r>
+        <w:t>terraform plan</w:t>
+      </w:r>
+    </w:p>
+    <w:p>
+      <w:r>
+        <w:t>terraform apply</w:t>
+      </w:r>
+    </w:p>
+    <w:p>
+      <w:r>
+        <w:drawing>
+          <wp:inline distT="0" distB="0" distL="0" distR="0" wp14:anchorId="476CD5A5" wp14:editId="5A7243C0">
+            <wp:extent cx="6675120" cy="2607945"/>
+            <wp:effectExtent l="0" t="0" r="0" b="1905"/>
+            <wp:docPr id="1391186346" name="Gambar 1"/>
+            <wp:cNvGraphicFramePr>
+              <a:graphicFrameLocks xmlns:a="http://schemas.openxmlformats.org/drawingml/2006/main" noChangeAspect="1"/>
+            </wp:cNvGraphicFramePr>
+            <a:graphic xmlns:a="http://schemas.openxmlformats.org/drawingml/2006/main">
+              <a:graphicData uri="http://schemas.openxmlformats.org/drawingml/2006/picture">
+                <pic:pic xmlns:pic="http://schemas.openxmlformats.org/drawingml/2006/picture">
+                  <pic:nvPicPr>
+                    <pic:cNvPr id="1391186346" name=""/>
+                    <pic:cNvPicPr/>
+                  </pic:nvPicPr>
+                  <pic:blipFill>
+                    <a:blip r:embed="rId11"/>
+                    <a:stretch>
+                      <a:fillRect/>
+                    </a:stretch>
+                  </pic:blipFill>
+                  <pic:spPr>
+                    <a:xfrm>
+                      <a:off x="0" y="0"/>
+                      <a:ext cx="6675120" cy="2607945"/>
+                    </a:xfrm>
+                    <a:prstGeom prst="rect">
+                      <a:avLst/>
+                    </a:prstGeom>
+                  </pic:spPr>
+                </pic:pic>
+              </a:graphicData>
+            </a:graphic>
+          </wp:inline>
+        </w:drawing>
+      </w:r>
+    </w:p>
+    <w:p>
+      <w:r>
+        <w:t xml:space="preserve">Successful create </w:t>
+      </w:r>
+      <w:proofErr w:type="spellStart"/>
+      <w:r>
+        <w:t>gke</w:t>
+      </w:r>
+      <w:proofErr w:type="spellEnd"/>
+      <w:r>
+        <w:t xml:space="preserve"> cluster regional, 1 node per zone</w:t>
+      </w:r>
+    </w:p>
+    <w:p>
+      <w:pPr>
+        <w:pStyle w:val="Judul2"/>
+        <w:numPr>
+          <w:ilvl w:val="1"/>
+          <w:numId w:val="1"/>
+        </w:numPr>
+        <w:ind w:left="540" w:hanging="540"/>
+      </w:pPr>
+      <w:r>
+        <w:t xml:space="preserve">Deploy </w:t>
+      </w:r>
+      <w:proofErr w:type="spellStart"/>
+      <w:r>
+        <w:t>kustomize</w:t>
+      </w:r>
+      <w:proofErr w:type="spellEnd"/>
+      <w:r>
+        <w:t xml:space="preserve"> manifest for nexus</w:t>
+      </w:r>
+    </w:p>
+    <w:p>
+      <w:r>
+        <w:t>Steps:</w:t>
+      </w:r>
+    </w:p>
+    <w:p>
+      <w:r>
+        <w:t xml:space="preserve">Connect to the </w:t>
+      </w:r>
+      <w:proofErr w:type="spellStart"/>
+      <w:r>
+        <w:t>gke</w:t>
+      </w:r>
+      <w:proofErr w:type="spellEnd"/>
+      <w:r>
+        <w:t xml:space="preserve"> cluster.</w:t>
+      </w:r>
+    </w:p>
+    <w:p>
+      <w:r>
+        <w:t>cd nexus-</w:t>
+      </w:r>
+      <w:proofErr w:type="spellStart"/>
+      <w:r>
+        <w:t>kustomize</w:t>
+      </w:r>
+      <w:proofErr w:type="spellEnd"/>
+    </w:p>
+    <w:p>
+      <w:proofErr w:type="spellStart"/>
+      <w:r>
+        <w:t>kubectl</w:t>
+      </w:r>
+      <w:proofErr w:type="spellEnd"/>
+      <w:r>
+        <w:t xml:space="preserve"> apply -k overlays/dev</w:t>
+      </w:r>
+    </w:p>
+    <w:p/>
     <w:p>
       <w:pPr>
         <w:pStyle w:val="Judul1"/>

</xml_diff>

<commit_message>
update deployment and add permision
</commit_message>
<xml_diff>
--- a/SRE Answer.docx
+++ b/SRE Answer.docx
@@ -557,6 +557,45 @@
       </w:r>
     </w:p>
     <w:p>
+      <w:r>
+        <w:drawing>
+          <wp:inline distT="0" distB="0" distL="0" distR="0" wp14:anchorId="161C5D78" wp14:editId="593A8F99">
+            <wp:extent cx="2921150" cy="1911448"/>
+            <wp:effectExtent l="0" t="0" r="0" b="0"/>
+            <wp:docPr id="256212836" name="Gambar 1"/>
+            <wp:cNvGraphicFramePr>
+              <a:graphicFrameLocks xmlns:a="http://schemas.openxmlformats.org/drawingml/2006/main" noChangeAspect="1"/>
+            </wp:cNvGraphicFramePr>
+            <a:graphic xmlns:a="http://schemas.openxmlformats.org/drawingml/2006/main">
+              <a:graphicData uri="http://schemas.openxmlformats.org/drawingml/2006/picture">
+                <pic:pic xmlns:pic="http://schemas.openxmlformats.org/drawingml/2006/picture">
+                  <pic:nvPicPr>
+                    <pic:cNvPr id="256212836" name=""/>
+                    <pic:cNvPicPr/>
+                  </pic:nvPicPr>
+                  <pic:blipFill>
+                    <a:blip r:embed="rId11"/>
+                    <a:stretch>
+                      <a:fillRect/>
+                    </a:stretch>
+                  </pic:blipFill>
+                  <pic:spPr>
+                    <a:xfrm>
+                      <a:off x="0" y="0"/>
+                      <a:ext cx="2921150" cy="1911448"/>
+                    </a:xfrm>
+                    <a:prstGeom prst="rect">
+                      <a:avLst/>
+                    </a:prstGeom>
+                  </pic:spPr>
+                </pic:pic>
+              </a:graphicData>
+            </a:graphic>
+          </wp:inline>
+        </w:drawing>
+      </w:r>
+    </w:p>
+    <w:p>
       <w:pPr>
         <w:pStyle w:val="Judul1"/>
         <w:numPr>
@@ -566,7 +605,47 @@
         <w:ind w:left="540" w:hanging="540"/>
       </w:pPr>
       <w:r>
+        <w:lastRenderedPageBreak/>
         <w:t>GCP resource creation</w:t>
+      </w:r>
+    </w:p>
+    <w:p>
+      <w:r>
+        <w:drawing>
+          <wp:inline distT="0" distB="0" distL="0" distR="0" wp14:anchorId="3342CC26" wp14:editId="249EA194">
+            <wp:extent cx="3238666" cy="3410125"/>
+            <wp:effectExtent l="0" t="0" r="0" b="0"/>
+            <wp:docPr id="1920074212" name="Gambar 1"/>
+            <wp:cNvGraphicFramePr>
+              <a:graphicFrameLocks xmlns:a="http://schemas.openxmlformats.org/drawingml/2006/main" noChangeAspect="1"/>
+            </wp:cNvGraphicFramePr>
+            <a:graphic xmlns:a="http://schemas.openxmlformats.org/drawingml/2006/main">
+              <a:graphicData uri="http://schemas.openxmlformats.org/drawingml/2006/picture">
+                <pic:pic xmlns:pic="http://schemas.openxmlformats.org/drawingml/2006/picture">
+                  <pic:nvPicPr>
+                    <pic:cNvPr id="1920074212" name=""/>
+                    <pic:cNvPicPr/>
+                  </pic:nvPicPr>
+                  <pic:blipFill>
+                    <a:blip r:embed="rId12"/>
+                    <a:stretch>
+                      <a:fillRect/>
+                    </a:stretch>
+                  </pic:blipFill>
+                  <pic:spPr>
+                    <a:xfrm>
+                      <a:off x="0" y="0"/>
+                      <a:ext cx="3238666" cy="3410125"/>
+                    </a:xfrm>
+                    <a:prstGeom prst="rect">
+                      <a:avLst/>
+                    </a:prstGeom>
+                  </pic:spPr>
+                </pic:pic>
+              </a:graphicData>
+            </a:graphic>
+          </wp:inline>
+        </w:drawing>
       </w:r>
     </w:p>
     <w:p>
@@ -602,42 +681,45 @@
     </w:p>
     <w:p>
       <w:r>
+        <w:t xml:space="preserve">cd </w:t>
+      </w:r>
+      <w:proofErr w:type="gramStart"/>
+      <w:r>
+        <w:t>terraform</w:t>
+      </w:r>
+      <w:proofErr w:type="gramEnd"/>
+    </w:p>
+    <w:p>
+      <w:r>
+        <w:t xml:space="preserve">terraform </w:t>
+      </w:r>
+      <w:proofErr w:type="spellStart"/>
+      <w:r>
+        <w:t>init</w:t>
+      </w:r>
+      <w:proofErr w:type="spellEnd"/>
+    </w:p>
+    <w:p>
+      <w:r>
+        <w:t>terraform validate</w:t>
+      </w:r>
+    </w:p>
+    <w:p>
+      <w:r>
+        <w:t>terraform plan</w:t>
+      </w:r>
+    </w:p>
+    <w:p>
+      <w:r>
+        <w:t>terraform apply</w:t>
+      </w:r>
+    </w:p>
+    <w:p>
+      <w:r>
+        <w:rPr>
+          <w:noProof/>
+        </w:rPr>
         <w:lastRenderedPageBreak/>
-        <w:t xml:space="preserve">cd </w:t>
-      </w:r>
-      <w:proofErr w:type="gramStart"/>
-      <w:r>
-        <w:t>terraform</w:t>
-      </w:r>
-      <w:proofErr w:type="gramEnd"/>
-    </w:p>
-    <w:p>
-      <w:r>
-        <w:t xml:space="preserve">terraform </w:t>
-      </w:r>
-      <w:proofErr w:type="spellStart"/>
-      <w:r>
-        <w:t>init</w:t>
-      </w:r>
-      <w:proofErr w:type="spellEnd"/>
-    </w:p>
-    <w:p>
-      <w:r>
-        <w:t>terraform validate</w:t>
-      </w:r>
-    </w:p>
-    <w:p>
-      <w:r>
-        <w:t>terraform plan</w:t>
-      </w:r>
-    </w:p>
-    <w:p>
-      <w:r>
-        <w:t>terraform apply</w:t>
-      </w:r>
-    </w:p>
-    <w:p>
-      <w:r>
         <w:drawing>
           <wp:inline distT="0" distB="0" distL="0" distR="0" wp14:anchorId="476CD5A5" wp14:editId="5A7243C0">
             <wp:extent cx="6675120" cy="2607945"/>
@@ -654,7 +736,7 @@
                     <pic:cNvPicPr/>
                   </pic:nvPicPr>
                   <pic:blipFill>
-                    <a:blip r:embed="rId11"/>
+                    <a:blip r:embed="rId13"/>
                     <a:stretch>
                       <a:fillRect/>
                     </a:stretch>
@@ -729,6 +811,45 @@
     </w:p>
     <w:p>
       <w:r>
+        <w:drawing>
+          <wp:inline distT="0" distB="0" distL="0" distR="0" wp14:anchorId="21309AED" wp14:editId="4468BB79">
+            <wp:extent cx="6675120" cy="1042035"/>
+            <wp:effectExtent l="0" t="0" r="0" b="5715"/>
+            <wp:docPr id="871170761" name="Gambar 1"/>
+            <wp:cNvGraphicFramePr>
+              <a:graphicFrameLocks xmlns:a="http://schemas.openxmlformats.org/drawingml/2006/main" noChangeAspect="1"/>
+            </wp:cNvGraphicFramePr>
+            <a:graphic xmlns:a="http://schemas.openxmlformats.org/drawingml/2006/main">
+              <a:graphicData uri="http://schemas.openxmlformats.org/drawingml/2006/picture">
+                <pic:pic xmlns:pic="http://schemas.openxmlformats.org/drawingml/2006/picture">
+                  <pic:nvPicPr>
+                    <pic:cNvPr id="871170761" name=""/>
+                    <pic:cNvPicPr/>
+                  </pic:nvPicPr>
+                  <pic:blipFill>
+                    <a:blip r:embed="rId14"/>
+                    <a:stretch>
+                      <a:fillRect/>
+                    </a:stretch>
+                  </pic:blipFill>
+                  <pic:spPr>
+                    <a:xfrm>
+                      <a:off x="0" y="0"/>
+                      <a:ext cx="6675120" cy="1042035"/>
+                    </a:xfrm>
+                    <a:prstGeom prst="rect">
+                      <a:avLst/>
+                    </a:prstGeom>
+                  </pic:spPr>
+                </pic:pic>
+              </a:graphicData>
+            </a:graphic>
+          </wp:inline>
+        </w:drawing>
+      </w:r>
+    </w:p>
+    <w:p>
+      <w:r>
         <w:t>cd nexus-</w:t>
       </w:r>
       <w:proofErr w:type="spellStart"/>
@@ -747,7 +868,45 @@
         <w:t xml:space="preserve"> apply -k overlays/dev</w:t>
       </w:r>
     </w:p>
-    <w:p/>
+    <w:p>
+      <w:r>
+        <w:drawing>
+          <wp:inline distT="0" distB="0" distL="0" distR="0" wp14:anchorId="4103A2F3" wp14:editId="16DE1818">
+            <wp:extent cx="6675120" cy="1005840"/>
+            <wp:effectExtent l="0" t="0" r="0" b="3810"/>
+            <wp:docPr id="1280681993" name="Gambar 1"/>
+            <wp:cNvGraphicFramePr>
+              <a:graphicFrameLocks xmlns:a="http://schemas.openxmlformats.org/drawingml/2006/main" noChangeAspect="1"/>
+            </wp:cNvGraphicFramePr>
+            <a:graphic xmlns:a="http://schemas.openxmlformats.org/drawingml/2006/main">
+              <a:graphicData uri="http://schemas.openxmlformats.org/drawingml/2006/picture">
+                <pic:pic xmlns:pic="http://schemas.openxmlformats.org/drawingml/2006/picture">
+                  <pic:nvPicPr>
+                    <pic:cNvPr id="1280681993" name=""/>
+                    <pic:cNvPicPr/>
+                  </pic:nvPicPr>
+                  <pic:blipFill>
+                    <a:blip r:embed="rId15"/>
+                    <a:stretch>
+                      <a:fillRect/>
+                    </a:stretch>
+                  </pic:blipFill>
+                  <pic:spPr>
+                    <a:xfrm>
+                      <a:off x="0" y="0"/>
+                      <a:ext cx="6675120" cy="1005840"/>
+                    </a:xfrm>
+                    <a:prstGeom prst="rect">
+                      <a:avLst/>
+                    </a:prstGeom>
+                  </pic:spPr>
+                </pic:pic>
+              </a:graphicData>
+            </a:graphic>
+          </wp:inline>
+        </w:drawing>
+      </w:r>
+    </w:p>
     <w:p>
       <w:pPr>
         <w:pStyle w:val="Judul1"/>
@@ -761,6 +920,7 @@
         <w:t>Continuous integration</w:t>
       </w:r>
     </w:p>
+    <w:p/>
     <w:sectPr>
       <w:type w:val="continuous"/>
       <w:pgSz w:w="12240" w:h="15840"/>

</xml_diff>